<commit_message>
Sectie 12 backup/GitHub toegevoegd aan documentatie
</commit_message>
<xml_diff>
--- a/Fitkompas-documentatie.docx
+++ b/Fitkompas-documentatie.docx
@@ -3350,7 +3350,7 @@
         </w:numPr>
       </w:pPr>
       <w:r>
-        <w:t xml:space="preserve">Uitnodigingspagina voor coaches (/dashboard/invite) met deelbare link</w:t>
+        <w:t xml:space="preserve">Alle sessies pagina voor admin (/dashboard/sessions)</w:t>
       </w:r>
     </w:p>
     <w:p>
@@ -3362,7 +3362,7 @@
         </w:numPr>
       </w:pPr>
       <w:r>
-        <w:t xml:space="preserve">Mijn respondenten pagina voor coaches met resultaten per respondent</w:t>
+        <w:t xml:space="preserve">Engelstalige versie van de app</w:t>
       </w:r>
     </w:p>
     <w:p>
@@ -3374,7 +3374,64 @@
         </w:numPr>
       </w:pPr>
       <w:r>
-        <w:t xml:space="preserve">Alle sessies pagina voor admin</w:t>
+        <w:t xml:space="preserve">Deployen naar Vercel (NEXT_PUBLIC_APP_URL aanpassen + nieuwe Stripe webhook instellen)</w:t>
+      </w:r>
+    </w:p>
+    <w:p>
+      <w:r>
+        <w:t xml:space="preserve"/>
+      </w:r>
+    </w:p>
+    <w:p>
+      <w:pPr>
+        <w:pStyle w:val="Heading1"/>
+      </w:pPr>
+      <w:r>
+        <w:t xml:space="preserve">12. Backup en versiebeheer</w:t>
+      </w:r>
+    </w:p>
+    <w:p>
+      <w:r>
+        <w:rPr>
+          <w:b/>
+        </w:rPr>
+        <w:t xml:space="preserve">GitHub repository</w:t>
+      </w:r>
+    </w:p>
+    <w:p>
+      <w:r>
+        <w:t xml:space="preserve">De volledige broncode staat op een private GitHub repository onder het ViveActive-account:</w:t>
+      </w:r>
+    </w:p>
+    <w:p>
+      <w:r>
+        <w:rPr>
+          <w:color w:val="1E3A8A"/>
+        </w:rPr>
+        <w:t xml:space="preserve">https://github.com/ViveActive/fitkompas</w:t>
+      </w:r>
+    </w:p>
+    <w:p>
+      <w:r>
+        <w:t xml:space="preserve">De repository bevat alle code inclusief het bestand REBUILD.md, waarin stap voor stap beschreven staat hoe de applicatie van nul herbouwd kan worden.</w:t>
+      </w:r>
+    </w:p>
+    <w:p>
+      <w:r>
+        <w:t xml:space="preserve"/>
+      </w:r>
+    </w:p>
+    <w:p>
+      <w:r>
+        <w:rPr>
+          <w:b/>
+        </w:rPr>
+        <w:t xml:space="preserve">Wat staat er NIET in de repository</w:t>
+      </w:r>
+    </w:p>
+    <w:p>
+      <w:r>
+        <w:t xml:space="preserve">Het bestand .env.local is bewust uitgesloten via .gitignore. Dit bestand bevat geheime sleutels en mag nooit op GitHub staan. Bij verlies van de laptop moeten de sleutels opnieuw worden opgehaald uit:</w:t>
       </w:r>
     </w:p>
     <w:p>
@@ -3386,7 +3443,7 @@
         </w:numPr>
       </w:pPr>
       <w:r>
-        <w:t xml:space="preserve">Rapportages pagina voor admin (meta-overzichten)</w:t>
+        <w:t xml:space="preserve">Supabase dashboard — project instellingen → API</w:t>
       </w:r>
     </w:p>
     <w:p>
@@ -3398,7 +3455,98 @@
         </w:numPr>
       </w:pPr>
       <w:r>
-        <w:t xml:space="preserve">Engelstalige versie van de app</w:t>
+        <w:t xml:space="preserve">Stripe dashboard — developers → API keys en webhooks</w:t>
+      </w:r>
+    </w:p>
+    <w:p>
+      <w:r>
+        <w:t xml:space="preserve"/>
+      </w:r>
+    </w:p>
+    <w:p>
+      <w:r>
+        <w:rPr>
+          <w:b/>
+        </w:rPr>
+        <w:t xml:space="preserve">Herstelstappen bij verlies van de laptop</w:t>
+      </w:r>
+    </w:p>
+    <w:p>
+      <w:pPr>
+        <w:pStyle w:val="ListParagraph"/>
+        <w:numPr>
+          <w:ilvl w:val="0"/>
+          <w:numId w:val="3"/>
+        </w:numPr>
+      </w:pPr>
+      <w:r>
+        <w:t xml:space="preserve">Nieuwe Mac: installeer Node.js en git</w:t>
+      </w:r>
+    </w:p>
+    <w:p>
+      <w:pPr>
+        <w:pStyle w:val="ListParagraph"/>
+        <w:numPr>
+          <w:ilvl w:val="0"/>
+          <w:numId w:val="3"/>
+        </w:numPr>
+      </w:pPr>
+      <w:r>
+        <w:t xml:space="preserve">Clone de repository: git clone git@github.com:ViveActive/fitkompas.git</w:t>
+      </w:r>
+    </w:p>
+    <w:p>
+      <w:pPr>
+        <w:pStyle w:val="ListParagraph"/>
+        <w:numPr>
+          <w:ilvl w:val="0"/>
+          <w:numId w:val="3"/>
+        </w:numPr>
+      </w:pPr>
+      <w:r>
+        <w:t xml:space="preserve">Maak .env.local opnieuw aan met sleutels uit Supabase en Stripe</w:t>
+      </w:r>
+    </w:p>
+    <w:p>
+      <w:pPr>
+        <w:pStyle w:val="ListParagraph"/>
+        <w:numPr>
+          <w:ilvl w:val="0"/>
+          <w:numId w:val="3"/>
+        </w:numPr>
+      </w:pPr>
+      <w:r>
+        <w:t xml:space="preserve">Installeer dependencies: npm install</w:t>
+      </w:r>
+    </w:p>
+    <w:p>
+      <w:pPr>
+        <w:pStyle w:val="ListParagraph"/>
+        <w:numPr>
+          <w:ilvl w:val="0"/>
+          <w:numId w:val="3"/>
+        </w:numPr>
+      </w:pPr>
+      <w:r>
+        <w:t xml:space="preserve">Start de applicatie: npm run dev</w:t>
+      </w:r>
+    </w:p>
+    <w:p>
+      <w:r>
+        <w:t xml:space="preserve"/>
+      </w:r>
+    </w:p>
+    <w:p>
+      <w:r>
+        <w:rPr>
+          <w:b/>
+        </w:rPr>
+        <w:t xml:space="preserve">Wijzigingen opslaan naar GitHub</w:t>
+      </w:r>
+    </w:p>
+    <w:p>
+      <w:r>
+        <w:t xml:space="preserve">Na elke sessie waarin code is aangepast, kunnen de wijzigingen worden opgeslagen met de volgende drie commando’s in de terminal vanuit de fitkompas map:</w:t>
       </w:r>
     </w:p>
     <w:p>
@@ -3410,7 +3558,31 @@
         </w:numPr>
       </w:pPr>
       <w:r>
-        <w:t xml:space="preserve">Deployen naar Vercel (NEXT_PUBLIC_APP_URL aanpassen + nieuwe Stripe webhook instellen)</w:t>
+        <w:t xml:space="preserve">git add -A</w:t>
+      </w:r>
+    </w:p>
+    <w:p>
+      <w:pPr>
+        <w:pStyle w:val="ListParagraph"/>
+        <w:numPr>
+          <w:ilvl w:val="0"/>
+          <w:numId w:val="2"/>
+        </w:numPr>
+      </w:pPr>
+      <w:r>
+        <w:t xml:space="preserve">git commit -m “omschrijving van de wijziging”</w:t>
+      </w:r>
+    </w:p>
+    <w:p>
+      <w:pPr>
+        <w:pStyle w:val="ListParagraph"/>
+        <w:numPr>
+          <w:ilvl w:val="0"/>
+          <w:numId w:val="2"/>
+        </w:numPr>
+      </w:pPr>
+      <w:r>
+        <w:t xml:space="preserve">git push</w:t>
       </w:r>
     </w:p>
     <w:p>
@@ -3429,7 +3601,7 @@
           <w:sz w:val="18"/>
           <w:szCs w:val="18"/>
         </w:rPr>
-        <w:t xml:space="preserve">Gegenereerd op 27 juni 2026 — ViveActive / Fitkompas</w:t>
+        <w:t xml:space="preserve">Bijgewerkt op 28 juni 2026 — ViveActive / Fitkompas</w:t>
       </w:r>
     </w:p>
     <w:sectPr>

</xml_diff>

<commit_message>
Update documentatie: meertaligheid en free trial (v1.2)
- Sectie 11: afgeronde punten gemarkeerd (sessies-pagina, EN-versie)
- Sectie 13 nieuw: Meertaligheid NL/EN — routes, dictionaries, LangSwitcher,
  pricing-vertalingen, dashboard taaldetectie
- Sectie 14 nieuw: Gratis proefperiode — flow, API-route, database
- Datum bijgewerkt naar 29 juni 2026

Co-Authored-By: Claude Sonnet 4.6 <noreply@anthropic.com>
</commit_message>
<xml_diff>
--- a/Fitkompas-documentatie.docx
+++ b/Fitkompas-documentatie.docx
@@ -3350,7 +3350,7 @@
         </w:numPr>
       </w:pPr>
       <w:r>
-        <w:t xml:space="preserve">Alle sessies pagina voor admin (/dashboard/sessions)</w:t>
+        <w:t xml:space="preserve">✓ Alle sessies pagina voor admin en coach (/dashboard/sessions) — afgerond</w:t>
       </w:r>
     </w:p>
     <w:p>
@@ -3362,7 +3362,7 @@
         </w:numPr>
       </w:pPr>
       <w:r>
-        <w:t xml:space="preserve">Engelstalige versie van de app</w:t>
+        <w:t xml:space="preserve">✓ Engelstalige versie van de app — afgerond (zie sectie 13)</w:t>
       </w:r>
     </w:p>
     <w:p>
@@ -3583,6 +3583,223 @@
       </w:pPr>
       <w:r>
         <w:t xml:space="preserve">git push</w:t>
+      </w:r>
+    </w:p>
+    <w:p>
+      <w:r>
+        <w:t xml:space="preserve"/>
+      </w:r>
+    </w:p>
+    <w:p>
+      <w:pPr>
+        <w:pStyle w:val="Heading1"/>
+      </w:pPr>
+      <w:r>
+        <w:t xml:space="preserve">13. Meertaligheid (NL/EN)</w:t>
+      </w:r>
+    </w:p>
+    <w:p>
+      <w:r>
+        <w:t xml:space="preserve">Fitkompas ondersteunt Nederlands en Engels. Alle publieke pagina’s zijn beschikbaar via een taalprefix in de URL: /nl/... en /en/.... Het dashboard blijft Nederlandstalig.</w:t>
+      </w:r>
+    </w:p>
+    <w:p>
+      <w:r>
+        <w:t xml:space="preserve"/>
+      </w:r>
+    </w:p>
+    <w:p>
+      <w:pPr>
+        <w:pStyle w:val="Heading2"/>
+      </w:pPr>
+      <w:r>
+        <w:t xml:space="preserve">Routestructuur</w:t>
+      </w:r>
+    </w:p>
+    <w:p>
+      <w:r>
+        <w:t xml:space="preserve">Alle publieke pagina’s staan onder src/app/[lang]/. De middleware detecteert de browser-taal en stuurt bezoekers van / automatisch door naar /nl of /en. Oude links (/login, /register, etc.) worden doorgestuurd naar /nl/...</w:t>
+      </w:r>
+    </w:p>
+    <w:p>
+      <w:r>
+        <w:t xml:space="preserve"/>
+      </w:r>
+    </w:p>
+    <w:p>
+      <w:pPr>
+        <w:pStyle w:val="Heading2"/>
+      </w:pPr>
+      <w:r>
+        <w:t xml:space="preserve">Vertalingen</w:t>
+      </w:r>
+    </w:p>
+    <w:p>
+      <w:r>
+        <w:t xml:space="preserve">Teksten staan in JSON-bestanden: src/dictionaries/nl.json en src/dictionaries/en.json. De functie getDictionary(lang) laadt het juiste woordenboek op de server. Elke pagina krijgt de vertalingen als prop.</w:t>
+      </w:r>
+    </w:p>
+    <w:p>
+      <w:r>
+        <w:t xml:space="preserve"/>
+      </w:r>
+    </w:p>
+    <w:p>
+      <w:pPr>
+        <w:pStyle w:val="Heading2"/>
+      </w:pPr>
+      <w:r>
+        <w:t xml:space="preserve">Taalschakelaar (LangSwitcher)</w:t>
+      </w:r>
+    </w:p>
+    <w:p>
+      <w:r>
+        <w:t xml:space="preserve">De component src/components/layout/LangSwitcher.tsx toont NL | EN op elke publieke pagina. Bij klikken wordt het taalprefix in de URL vervangen. De huidige taal wordt vetgedrukt weergegeven.</w:t>
+      </w:r>
+    </w:p>
+    <w:p>
+      <w:r>
+        <w:t xml:space="preserve"/>
+      </w:r>
+    </w:p>
+    <w:p>
+      <w:pPr>
+        <w:pStyle w:val="Heading2"/>
+      </w:pPr>
+      <w:r>
+        <w:t xml:space="preserve">Pricing plans vertalen</w:t>
+      </w:r>
+    </w:p>
+    <w:p>
+      <w:r>
+        <w:t xml:space="preserve">De tabel pricing_plans heeft kolommen voor Engelse vertalingen: name_en, description_en, features_en (jsonb), period_en, badge_en. De admin vult deze in via het pricing-dashboard (/dashboard/pricing). Bij lege EN-velden wordt de Nederlandse tekst als fallback gebruikt.</w:t>
+      </w:r>
+    </w:p>
+    <w:p>
+      <w:r>
+        <w:t xml:space="preserve"/>
+      </w:r>
+    </w:p>
+    <w:p>
+      <w:pPr>
+        <w:pStyle w:val="Heading2"/>
+      </w:pPr>
+      <w:r>
+        <w:t xml:space="preserve">Dashboard taaldetectie</w:t>
+      </w:r>
+    </w:p>
+    <w:p>
+      <w:r>
+        <w:t xml:space="preserve">Het respondenten-dashboard leest de Accept-Language header en linkt de “Vragenlijst invullen”-knop door naar /nl/survey of /en/survey. Zo krijgt een Engelstalige gebruiker automatisch de Engelse vragenlijst en resultaten.</w:t>
+      </w:r>
+    </w:p>
+    <w:p>
+      <w:r>
+        <w:t xml:space="preserve"/>
+      </w:r>
+    </w:p>
+    <w:p>
+      <w:pPr>
+        <w:pStyle w:val="Heading1"/>
+      </w:pPr>
+      <w:r>
+        <w:t xml:space="preserve">14. Gratis proefperiode (free trial)</w:t>
+      </w:r>
+    </w:p>
+    <w:p>
+      <w:r>
+        <w:t xml:space="preserve">Nieuwe coaches kunnen Fitkompas gratis uitproberen met 2 credits, zonder creditcard. Na het opgebruiken van de credits kunnen zij upgraden naar een betaald plan.</w:t>
+      </w:r>
+    </w:p>
+    <w:p>
+      <w:r>
+        <w:t xml:space="preserve"/>
+      </w:r>
+    </w:p>
+    <w:p>
+      <w:pPr>
+        <w:pStyle w:val="Heading2"/>
+      </w:pPr>
+      <w:r>
+        <w:t xml:space="preserve">Flow</w:t>
+      </w:r>
+    </w:p>
+    <w:p>
+      <w:pPr>
+        <w:pStyle w:val="ListParagraph"/>
+        <w:numPr>
+          <w:ilvl w:val="0"/>
+          <w:numId w:val="3"/>
+        </w:numPr>
+      </w:pPr>
+      <w:r>
+        <w:t xml:space="preserve">Coach klikt “Gratis proberen” op de pricing pagina (groene banner boven de betaalde plannen)</w:t>
+      </w:r>
+    </w:p>
+    <w:p>
+      <w:pPr>
+        <w:pStyle w:val="ListParagraph"/>
+        <w:numPr>
+          <w:ilvl w:val="0"/>
+          <w:numId w:val="3"/>
+        </w:numPr>
+      </w:pPr>
+      <w:r>
+        <w:t xml:space="preserve">Aanmeldformulier op /register-coach?plan=free_trial — geen Stripe betaling</w:t>
+      </w:r>
+    </w:p>
+    <w:p>
+      <w:pPr>
+        <w:pStyle w:val="ListParagraph"/>
+        <w:numPr>
+          <w:ilvl w:val="0"/>
+          <w:numId w:val="3"/>
+        </w:numPr>
+      </w:pPr>
+      <w:r>
+        <w:t xml:space="preserve">API-route /api/free-trial maakt direct een coach_subscription aan met credits_total = 2</w:t>
+      </w:r>
+    </w:p>
+    <w:p>
+      <w:pPr>
+        <w:pStyle w:val="ListParagraph"/>
+        <w:numPr>
+          <w:ilvl w:val="0"/>
+          <w:numId w:val="3"/>
+        </w:numPr>
+      </w:pPr>
+      <w:r>
+        <w:t xml:space="preserve">Coach krijgt een coach-code en wordt doorgestuurd naar het dashboard</w:t>
+      </w:r>
+    </w:p>
+    <w:p>
+      <w:pPr>
+        <w:pStyle w:val="ListParagraph"/>
+        <w:numPr>
+          <w:ilvl w:val="0"/>
+          <w:numId w:val="3"/>
+        </w:numPr>
+      </w:pPr>
+      <w:r>
+        <w:t xml:space="preserve">Na 2 respondenten blokkeert het systeem nieuwe uitnodigingen — coach ziet de limiet en kan upgraden</w:t>
+      </w:r>
+    </w:p>
+    <w:p>
+      <w:r>
+        <w:t xml:space="preserve"/>
+      </w:r>
+    </w:p>
+    <w:p>
+      <w:pPr>
+        <w:pStyle w:val="Heading2"/>
+      </w:pPr>
+      <w:r>
+        <w:t xml:space="preserve">Database</w:t>
+      </w:r>
+    </w:p>
+    <w:p>
+      <w:r>
+        <w:t xml:space="preserve">Het plan staat in de tabel pricing_plans met id = “free_trial”, max_respondents = 2, geen stripe_price_id. De coach_subscriptions-rij heeft stripe_customer_id = null en stripe_subscription_id = null.</w:t>
       </w:r>
     </w:p>
     <w:p>
@@ -3601,7 +3818,7 @@
           <w:sz w:val="18"/>
           <w:szCs w:val="18"/>
         </w:rPr>
-        <w:t xml:space="preserve">Bijgewerkt op 28 juni 2026 — ViveActive / Fitkompas</w:t>
+        <w:t xml:space="preserve">Bijgewerkt op 29 juni 2026 — ViveActive / Fitkompas</w:t>
       </w:r>
     </w:p>
     <w:sectPr>

</xml_diff>